<commit_message>
test(docx): add test for sequential numbering in reused list groups
Signed-off-by: Cesar Berrospi Ramis <ceb@zurich.ibm.com>
</commit_message>
<xml_diff>
--- a/tests/data/docx/unit_test_lists.docx
+++ b/tests/data/docx/unit_test_lists.docx
@@ -1,6 +1,6 @@
 
 <file path=word/document.xml><?xml version="1.0" encoding="utf-8"?>
-<w:document xmlns:wpc="http://schemas.microsoft.com/office/word/2010/wordprocessingCanvas" xmlns:cx="http://schemas.microsoft.com/office/drawing/2014/chartex" xmlns:cx1="http://schemas.microsoft.com/office/drawing/2015/9/8/chartex" xmlns:cx2="http://schemas.microsoft.com/office/drawing/2015/10/21/chartex" xmlns:cx3="http://schemas.microsoft.com/office/drawing/2016/5/9/chartex" xmlns:cx4="http://schemas.microsoft.com/office/drawing/2016/5/10/chartex" xmlns:cx5="http://schemas.microsoft.com/office/drawing/2016/5/11/chartex" xmlns:cx6="http://schemas.microsoft.com/office/drawing/2016/5/12/chartex" xmlns:cx7="http://schemas.microsoft.com/office/drawing/2016/5/13/chartex" xmlns:cx8="http://schemas.microsoft.com/office/drawing/2016/5/14/chartex" xmlns:mc="http://schemas.openxmlformats.org/markup-compatibility/2006" xmlns:aink="http://schemas.microsoft.com/office/drawing/2016/ink" xmlns:am3d="http://schemas.microsoft.com/office/drawing/2017/model3d" xmlns:o="urn:schemas-microsoft-com:office:office" xmlns:oel="http://schemas.microsoft.com/office/2019/extlst" xmlns:r="http://schemas.openxmlformats.org/officeDocument/2006/relationships" xmlns:m="http://schemas.openxmlformats.org/officeDocument/2006/math" xmlns:v="urn:schemas-microsoft-com:vml" xmlns:wp14="http://schemas.microsoft.com/office/word/2010/wordprocessingDrawing" xmlns:wp="http://schemas.openxmlformats.org/drawingml/2006/wordprocessingDrawing" xmlns:w10="urn:schemas-microsoft-com:office:word" xmlns:w="http://schemas.openxmlformats.org/wordprocessingml/2006/main" xmlns:w14="http://schemas.microsoft.com/office/word/2010/wordml" xmlns:w15="http://schemas.microsoft.com/office/word/2012/wordml" xmlns:w16cex="http://schemas.microsoft.com/office/word/2018/wordml/cex" xmlns:w16cid="http://schemas.microsoft.com/office/word/2016/wordml/cid" xmlns:w16="http://schemas.microsoft.com/office/word/2018/wordml" xmlns:w16du="http://schemas.microsoft.com/office/word/2023/wordml/word16du" xmlns:w16sdtdh="http://schemas.microsoft.com/office/word/2020/wordml/sdtdatahash" xmlns:w16se="http://schemas.microsoft.com/office/word/2015/wordml/symex" xmlns:wpg="http://schemas.microsoft.com/office/word/2010/wordprocessingGroup" xmlns:wpi="http://schemas.microsoft.com/office/word/2010/wordprocessingInk" xmlns:wne="http://schemas.microsoft.com/office/word/2006/wordml" xmlns:wps="http://schemas.microsoft.com/office/word/2010/wordprocessingShape" mc:Ignorable="w14 w15 w16se w16cid w16 w16cex w16sdtdh w16du wp14">
+<w:document xmlns:wpc="http://schemas.microsoft.com/office/word/2010/wordprocessingCanvas" xmlns:cx="http://schemas.microsoft.com/office/drawing/2014/chartex" xmlns:cx1="http://schemas.microsoft.com/office/drawing/2015/9/8/chartex" xmlns:cx2="http://schemas.microsoft.com/office/drawing/2015/10/21/chartex" xmlns:cx3="http://schemas.microsoft.com/office/drawing/2016/5/9/chartex" xmlns:cx4="http://schemas.microsoft.com/office/drawing/2016/5/10/chartex" xmlns:cx5="http://schemas.microsoft.com/office/drawing/2016/5/11/chartex" xmlns:cx6="http://schemas.microsoft.com/office/drawing/2016/5/12/chartex" xmlns:cx7="http://schemas.microsoft.com/office/drawing/2016/5/13/chartex" xmlns:cx8="http://schemas.microsoft.com/office/drawing/2016/5/14/chartex" xmlns:mc="http://schemas.openxmlformats.org/markup-compatibility/2006" xmlns:aink="http://schemas.microsoft.com/office/drawing/2016/ink" xmlns:am3d="http://schemas.microsoft.com/office/drawing/2017/model3d" xmlns:o="urn:schemas-microsoft-com:office:office" xmlns:oel="http://schemas.microsoft.com/office/2019/extlst" xmlns:r="http://schemas.openxmlformats.org/officeDocument/2006/relationships" xmlns:m="http://schemas.openxmlformats.org/officeDocument/2006/math" xmlns:v="urn:schemas-microsoft-com:vml" xmlns:wp14="http://schemas.microsoft.com/office/word/2010/wordprocessingDrawing" xmlns:wp="http://schemas.openxmlformats.org/drawingml/2006/wordprocessingDrawing" xmlns:w10="urn:schemas-microsoft-com:office:word" xmlns:w="http://schemas.openxmlformats.org/wordprocessingml/2006/main" xmlns:w14="http://schemas.microsoft.com/office/word/2010/wordml" xmlns:w15="http://schemas.microsoft.com/office/word/2012/wordml" xmlns:w16cex="http://schemas.microsoft.com/office/word/2018/wordml/cex" xmlns:w16cid="http://schemas.microsoft.com/office/word/2016/wordml/cid" xmlns:w16="http://schemas.microsoft.com/office/word/2018/wordml" xmlns:w16du="http://schemas.microsoft.com/office/word/2023/wordml/word16du" xmlns:w16sdtdh="http://schemas.microsoft.com/office/word/2020/wordml/sdtdatahash" xmlns:w16sdtfl="http://schemas.microsoft.com/office/word/2024/wordml/sdtformatlock" xmlns:w16se="http://schemas.microsoft.com/office/word/2015/wordml/symex" xmlns:wpg="http://schemas.microsoft.com/office/word/2010/wordprocessingGroup" xmlns:wpi="http://schemas.microsoft.com/office/word/2010/wordprocessingInk" xmlns:wne="http://schemas.microsoft.com/office/word/2006/wordml" xmlns:wps="http://schemas.microsoft.com/office/word/2010/wordprocessingShape" mc:Ignorable="w14 w15 w16se w16cid w16 w16cex w16sdtdh w16sdtfl w16du wp14">
   <w:body>
     <w:p>
       <w:pPr>
@@ -14,25 +14,13 @@
     <w:p/>
     <w:p>
       <w:r>
-        <w:t xml:space="preserve">Paragraph </w:t>
-      </w:r>
-      <w:r>
-        <w:t>2</w:t>
-      </w:r>
-      <w:r>
-        <w:t>.1.1</w:t>
+        <w:t>Paragraph 2.1.1</w:t>
       </w:r>
     </w:p>
     <w:p/>
     <w:p>
       <w:r>
-        <w:t xml:space="preserve">Paragraph </w:t>
-      </w:r>
-      <w:r>
-        <w:t>2</w:t>
-      </w:r>
-      <w:r>
-        <w:t>.1.2</w:t>
+        <w:t>Paragraph 2.1.2</w:t>
       </w:r>
     </w:p>
     <w:p/>
@@ -65,10 +53,7 @@
         </w:numPr>
       </w:pPr>
       <w:r>
-        <w:t xml:space="preserve">List item </w:t>
-      </w:r>
-      <w:r>
-        <w:t>2</w:t>
+        <w:t>List item 2</w:t>
       </w:r>
     </w:p>
     <w:p>
@@ -80,10 +65,7 @@
         </w:numPr>
       </w:pPr>
       <w:r>
-        <w:t xml:space="preserve">List item </w:t>
-      </w:r>
-      <w:r>
-        <w:t>3</w:t>
+        <w:t>List item 3</w:t>
       </w:r>
     </w:p>
     <w:p/>
@@ -92,13 +74,7 @@
         <w:pStyle w:val="Heading3"/>
       </w:pPr>
       <w:r>
-        <w:t xml:space="preserve">Test </w:t>
-      </w:r>
-      <w:r>
-        <w:t>2</w:t>
-      </w:r>
-      <w:r>
-        <w:t>:</w:t>
+        <w:t>Test 2:</w:t>
       </w:r>
     </w:p>
     <w:p>
@@ -152,13 +128,7 @@
         <w:pStyle w:val="Heading3"/>
       </w:pPr>
       <w:r>
-        <w:t xml:space="preserve">Test </w:t>
-      </w:r>
-      <w:r>
-        <w:t>3</w:t>
-      </w:r>
-      <w:r>
-        <w:t>:</w:t>
+        <w:t>Test 3:</w:t>
       </w:r>
     </w:p>
     <w:p>
@@ -197,10 +167,7 @@
         </w:numPr>
       </w:pPr>
       <w:r>
-        <w:t xml:space="preserve">List item </w:t>
-      </w:r>
-      <w:r>
-        <w:t>1</w:t>
+        <w:t>List item 1</w:t>
       </w:r>
       <w:r>
         <w:t>.1</w:t>
@@ -254,13 +221,7 @@
         <w:pStyle w:val="Heading3"/>
       </w:pPr>
       <w:r>
-        <w:t xml:space="preserve">Test </w:t>
-      </w:r>
-      <w:r>
-        <w:t>4</w:t>
-      </w:r>
-      <w:r>
-        <w:t>:</w:t>
+        <w:t>Test 4:</w:t>
       </w:r>
     </w:p>
     <w:p>
@@ -308,13 +269,7 @@
         <w:pStyle w:val="Heading3"/>
       </w:pPr>
       <w:r>
-        <w:t xml:space="preserve">Test </w:t>
-      </w:r>
-      <w:r>
-        <w:t>5</w:t>
-      </w:r>
-      <w:r>
-        <w:t>:</w:t>
+        <w:t>Test 5:</w:t>
       </w:r>
     </w:p>
     <w:p>
@@ -378,13 +333,7 @@
       </w:pPr>
       <w:r>
         <w:lastRenderedPageBreak/>
-        <w:t xml:space="preserve">Test </w:t>
-      </w:r>
-      <w:r>
-        <w:t>6</w:t>
-      </w:r>
-      <w:r>
-        <w:t>:</w:t>
+        <w:t>Test 6:</w:t>
       </w:r>
     </w:p>
     <w:p>
@@ -420,10 +369,7 @@
         </w:numPr>
       </w:pPr>
       <w:r>
-        <w:t xml:space="preserve">List item </w:t>
-      </w:r>
-      <w:r>
-        <w:t>1</w:t>
+        <w:t>List item 1</w:t>
       </w:r>
       <w:r>
         <w:t>.1</w:t>
@@ -456,10 +402,7 @@
         </w:numPr>
       </w:pPr>
       <w:r>
-        <w:t xml:space="preserve">List item </w:t>
-      </w:r>
-      <w:r>
-        <w:t>1</w:t>
+        <w:t>List item 1</w:t>
       </w:r>
       <w:r>
         <w:t>.2.1</w:t>
@@ -480,10 +423,229 @@
     <w:p/>
     <w:p/>
     <w:p>
+      <w:pPr>
+        <w:pStyle w:val="Heading3"/>
+      </w:pPr>
       <w:r>
         <w:t xml:space="preserve"> </w:t>
       </w:r>
-    </w:p>
+      <w:r>
+        <w:t>Test 7:</w:t>
+      </w:r>
+    </w:p>
+    <w:p>
+      <w:pPr>
+        <w:numPr>
+          <w:ilvl w:val="0"/>
+          <w:numId w:val="3"/>
+        </w:numPr>
+        <w:suppressAutoHyphens/>
+        <w:rPr>
+          <w:rFonts w:ascii="FangSong" w:eastAsia="FangSong" w:hAnsi="FangSong" w:cs="Segoe UI"/>
+          <w:color w:val="1C1F23"/>
+          <w:shd w:val="clear" w:color="auto" w:fill="FFFFFF"/>
+        </w:rPr>
+      </w:pPr>
+      <w:r>
+        <w:rPr>
+          <w:rFonts w:ascii="FangSong" w:eastAsia="FangSong" w:hAnsi="FangSong" w:cs="Segoe UI"/>
+          <w:color w:val="1C1F23"/>
+          <w:shd w:val="clear" w:color="auto" w:fill="FFFFFF"/>
+        </w:rPr>
+        <w:t xml:space="preserve">First item with </w:t>
+      </w:r>
+      <w:proofErr w:type="spellStart"/>
+      <w:r>
+        <w:rPr>
+          <w:rFonts w:ascii="FangSong" w:eastAsia="FangSong" w:hAnsi="FangSong" w:cs="Segoe UI"/>
+          <w:color w:val="1C1F23"/>
+          <w:shd w:val="clear" w:color="auto" w:fill="FFFFFF"/>
+        </w:rPr>
+        <w:t>numId</w:t>
+      </w:r>
+      <w:proofErr w:type="spellEnd"/>
+      <w:r>
+        <w:rPr>
+          <w:rFonts w:ascii="FangSong" w:eastAsia="FangSong" w:hAnsi="FangSong" w:cs="Segoe UI"/>
+          <w:color w:val="1C1F23"/>
+          <w:shd w:val="clear" w:color="auto" w:fill="FFFFFF"/>
+        </w:rPr>
+        <w:t xml:space="preserve"> 2</w:t>
+      </w:r>
+    </w:p>
+    <w:p>
+      <w:pPr>
+        <w:ind w:left="360"/>
+        <w:rPr>
+          <w:rFonts w:ascii="FangSong" w:eastAsia="FangSong" w:hAnsi="FangSong" w:cs="Segoe UI"/>
+          <w:color w:val="1C1F23"/>
+          <w:shd w:val="clear" w:color="auto" w:fill="FFFFFF"/>
+        </w:rPr>
+      </w:pPr>
+    </w:p>
+    <w:p>
+      <w:pPr>
+        <w:numPr>
+          <w:ilvl w:val="0"/>
+          <w:numId w:val="3"/>
+        </w:numPr>
+        <w:suppressAutoHyphens/>
+        <w:rPr>
+          <w:rFonts w:ascii="FangSong" w:eastAsia="FangSong" w:hAnsi="FangSong" w:cs="Segoe UI"/>
+          <w:color w:val="1C1F23"/>
+          <w:shd w:val="clear" w:color="auto" w:fill="FFFFFF"/>
+        </w:rPr>
+      </w:pPr>
+      <w:r>
+        <w:rPr>
+          <w:rFonts w:ascii="FangSong" w:eastAsia="FangSong" w:hAnsi="FangSong" w:cs="Segoe UI"/>
+          <w:color w:val="1C1F23"/>
+          <w:shd w:val="clear" w:color="auto" w:fill="FFFFFF"/>
+        </w:rPr>
+        <w:t xml:space="preserve">Second item with </w:t>
+      </w:r>
+      <w:proofErr w:type="spellStart"/>
+      <w:r>
+        <w:rPr>
+          <w:rFonts w:ascii="FangSong" w:eastAsia="FangSong" w:hAnsi="FangSong" w:cs="Segoe UI"/>
+          <w:color w:val="1C1F23"/>
+          <w:shd w:val="clear" w:color="auto" w:fill="FFFFFF"/>
+        </w:rPr>
+        <w:t>numId</w:t>
+      </w:r>
+      <w:proofErr w:type="spellEnd"/>
+      <w:r>
+        <w:rPr>
+          <w:rFonts w:ascii="FangSong" w:eastAsia="FangSong" w:hAnsi="FangSong" w:cs="Segoe UI"/>
+          <w:color w:val="1C1F23"/>
+          <w:shd w:val="clear" w:color="auto" w:fill="FFFFFF"/>
+        </w:rPr>
+        <w:t xml:space="preserve"> 2</w:t>
+      </w:r>
+    </w:p>
+    <w:p>
+      <w:pPr>
+        <w:pStyle w:val="ListParagraph"/>
+        <w:rPr>
+          <w:rFonts w:ascii="FangSong" w:eastAsia="FangSong" w:hAnsi="FangSong" w:cs="Segoe UI"/>
+          <w:color w:val="1C1F23"/>
+          <w:shd w:val="clear" w:color="auto" w:fill="FFFFFF"/>
+        </w:rPr>
+      </w:pPr>
+    </w:p>
+    <w:p>
+      <w:pPr>
+        <w:numPr>
+          <w:ilvl w:val="0"/>
+          <w:numId w:val="3"/>
+        </w:numPr>
+        <w:suppressAutoHyphens/>
+        <w:rPr>
+          <w:rFonts w:ascii="FangSong" w:eastAsia="FangSong" w:hAnsi="FangSong" w:cs="Segoe UI"/>
+          <w:color w:val="1F2329"/>
+        </w:rPr>
+      </w:pPr>
+      <w:r>
+        <w:rPr>
+          <w:rFonts w:ascii="FangSong" w:eastAsia="FangSong" w:hAnsi="FangSong" w:cs="Segoe UI"/>
+          <w:color w:val="1C1F23"/>
+          <w:shd w:val="clear" w:color="auto" w:fill="FFFFFF"/>
+        </w:rPr>
+        <w:t xml:space="preserve">Third item with </w:t>
+      </w:r>
+      <w:proofErr w:type="spellStart"/>
+      <w:r>
+        <w:rPr>
+          <w:rFonts w:ascii="FangSong" w:eastAsia="FangSong" w:hAnsi="FangSong" w:cs="Segoe UI"/>
+          <w:color w:val="1C1F23"/>
+          <w:shd w:val="clear" w:color="auto" w:fill="FFFFFF"/>
+        </w:rPr>
+        <w:t>numId</w:t>
+      </w:r>
+      <w:proofErr w:type="spellEnd"/>
+      <w:r>
+        <w:rPr>
+          <w:rFonts w:ascii="FangSong" w:eastAsia="FangSong" w:hAnsi="FangSong" w:cs="Segoe UI"/>
+          <w:color w:val="1C1F23"/>
+          <w:shd w:val="clear" w:color="auto" w:fill="FFFFFF"/>
+        </w:rPr>
+        <w:t xml:space="preserve"> 2</w:t>
+      </w:r>
+    </w:p>
+    <w:p>
+      <w:pPr>
+        <w:pStyle w:val="ListParagraph"/>
+        <w:rPr>
+          <w:rFonts w:ascii="FangSong" w:eastAsia="FangSong" w:hAnsi="FangSong" w:cs="Segoe UI"/>
+          <w:color w:val="1F2329"/>
+        </w:rPr>
+      </w:pPr>
+    </w:p>
+    <w:p>
+      <w:pPr>
+        <w:numPr>
+          <w:ilvl w:val="0"/>
+          <w:numId w:val="3"/>
+        </w:numPr>
+        <w:suppressAutoHyphens/>
+        <w:rPr>
+          <w:rFonts w:ascii="FangSong" w:eastAsia="FangSong" w:hAnsi="FangSong" w:cs="Segoe UI"/>
+          <w:color w:val="1F2329"/>
+        </w:rPr>
+      </w:pPr>
+      <w:r>
+        <w:rPr>
+          <w:rFonts w:ascii="FangSong" w:eastAsia="FangSong" w:hAnsi="FangSong" w:cs="Segoe UI"/>
+          <w:color w:val="1F2329"/>
+        </w:rPr>
+        <w:t xml:space="preserve">Fourth item with </w:t>
+      </w:r>
+      <w:proofErr w:type="spellStart"/>
+      <w:r>
+        <w:rPr>
+          <w:rFonts w:ascii="FangSong" w:eastAsia="FangSong" w:hAnsi="FangSong" w:cs="Segoe UI"/>
+          <w:color w:val="1F2329"/>
+        </w:rPr>
+        <w:t>numId</w:t>
+      </w:r>
+      <w:proofErr w:type="spellEnd"/>
+      <w:r>
+        <w:rPr>
+          <w:rFonts w:ascii="FangSong" w:eastAsia="FangSong" w:hAnsi="FangSong" w:cs="Segoe UI"/>
+          <w:color w:val="1F2329"/>
+        </w:rPr>
+        <w:t xml:space="preserve"> 2</w:t>
+      </w:r>
+    </w:p>
+    <w:p/>
+    <w:p>
+      <w:pPr>
+        <w:pStyle w:val="ListParagraph"/>
+        <w:numPr>
+          <w:ilvl w:val="0"/>
+          <w:numId w:val="4"/>
+        </w:numPr>
+        <w:suppressAutoHyphens/>
+      </w:pPr>
+      <w:r>
+        <w:t>Single item of a new list</w:t>
+      </w:r>
+    </w:p>
+    <w:p/>
+    <w:p>
+      <w:pPr>
+        <w:pStyle w:val="ListParagraph"/>
+        <w:numPr>
+          <w:ilvl w:val="0"/>
+          <w:numId w:val="5"/>
+        </w:numPr>
+        <w:suppressAutoHyphens/>
+      </w:pPr>
+      <w:r>
+        <w:t>Single item of a new list</w:t>
+      </w:r>
+    </w:p>
+    <w:p/>
     <w:sectPr>
       <w:pgSz w:w="12240" w:h="15840"/>
       <w:pgMar w:top="1440" w:right="1440" w:bottom="1440" w:left="1440" w:header="720" w:footer="720" w:gutter="0"/>
@@ -495,7 +657,7 @@
 </file>
 
 <file path=word/numbering.xml><?xml version="1.0" encoding="utf-8"?>
-<w:numbering xmlns:wpc="http://schemas.microsoft.com/office/word/2010/wordprocessingCanvas" xmlns:cx="http://schemas.microsoft.com/office/drawing/2014/chartex" xmlns:cx1="http://schemas.microsoft.com/office/drawing/2015/9/8/chartex" xmlns:cx2="http://schemas.microsoft.com/office/drawing/2015/10/21/chartex" xmlns:cx3="http://schemas.microsoft.com/office/drawing/2016/5/9/chartex" xmlns:cx4="http://schemas.microsoft.com/office/drawing/2016/5/10/chartex" xmlns:cx5="http://schemas.microsoft.com/office/drawing/2016/5/11/chartex" xmlns:cx6="http://schemas.microsoft.com/office/drawing/2016/5/12/chartex" xmlns:cx7="http://schemas.microsoft.com/office/drawing/2016/5/13/chartex" xmlns:cx8="http://schemas.microsoft.com/office/drawing/2016/5/14/chartex" xmlns:mc="http://schemas.openxmlformats.org/markup-compatibility/2006" xmlns:aink="http://schemas.microsoft.com/office/drawing/2016/ink" xmlns:am3d="http://schemas.microsoft.com/office/drawing/2017/model3d" xmlns:o="urn:schemas-microsoft-com:office:office" xmlns:oel="http://schemas.microsoft.com/office/2019/extlst" xmlns:r="http://schemas.openxmlformats.org/officeDocument/2006/relationships" xmlns:m="http://schemas.openxmlformats.org/officeDocument/2006/math" xmlns:v="urn:schemas-microsoft-com:vml" xmlns:wp14="http://schemas.microsoft.com/office/word/2010/wordprocessingDrawing" xmlns:wp="http://schemas.openxmlformats.org/drawingml/2006/wordprocessingDrawing" xmlns:w10="urn:schemas-microsoft-com:office:word" xmlns:w="http://schemas.openxmlformats.org/wordprocessingml/2006/main" xmlns:w14="http://schemas.microsoft.com/office/word/2010/wordml" xmlns:w15="http://schemas.microsoft.com/office/word/2012/wordml" xmlns:w16cex="http://schemas.microsoft.com/office/word/2018/wordml/cex" xmlns:w16cid="http://schemas.microsoft.com/office/word/2016/wordml/cid" xmlns:w16="http://schemas.microsoft.com/office/word/2018/wordml" xmlns:w16du="http://schemas.microsoft.com/office/word/2023/wordml/word16du" xmlns:w16sdtdh="http://schemas.microsoft.com/office/word/2020/wordml/sdtdatahash" xmlns:w16se="http://schemas.microsoft.com/office/word/2015/wordml/symex" xmlns:wpg="http://schemas.microsoft.com/office/word/2010/wordprocessingGroup" xmlns:wpi="http://schemas.microsoft.com/office/word/2010/wordprocessingInk" xmlns:wne="http://schemas.microsoft.com/office/word/2006/wordml" xmlns:wps="http://schemas.microsoft.com/office/word/2010/wordprocessingShape" mc:Ignorable="w14 w15 w16se w16cid w16 w16cex w16sdtdh w16du wp14">
+<w:numbering xmlns:wpc="http://schemas.microsoft.com/office/word/2010/wordprocessingCanvas" xmlns:cx="http://schemas.microsoft.com/office/drawing/2014/chartex" xmlns:cx1="http://schemas.microsoft.com/office/drawing/2015/9/8/chartex" xmlns:cx2="http://schemas.microsoft.com/office/drawing/2015/10/21/chartex" xmlns:cx3="http://schemas.microsoft.com/office/drawing/2016/5/9/chartex" xmlns:cx4="http://schemas.microsoft.com/office/drawing/2016/5/10/chartex" xmlns:cx5="http://schemas.microsoft.com/office/drawing/2016/5/11/chartex" xmlns:cx6="http://schemas.microsoft.com/office/drawing/2016/5/12/chartex" xmlns:cx7="http://schemas.microsoft.com/office/drawing/2016/5/13/chartex" xmlns:cx8="http://schemas.microsoft.com/office/drawing/2016/5/14/chartex" xmlns:mc="http://schemas.openxmlformats.org/markup-compatibility/2006" xmlns:aink="http://schemas.microsoft.com/office/drawing/2016/ink" xmlns:am3d="http://schemas.microsoft.com/office/drawing/2017/model3d" xmlns:o="urn:schemas-microsoft-com:office:office" xmlns:oel="http://schemas.microsoft.com/office/2019/extlst" xmlns:r="http://schemas.openxmlformats.org/officeDocument/2006/relationships" xmlns:m="http://schemas.openxmlformats.org/officeDocument/2006/math" xmlns:v="urn:schemas-microsoft-com:vml" xmlns:wp14="http://schemas.microsoft.com/office/word/2010/wordprocessingDrawing" xmlns:wp="http://schemas.openxmlformats.org/drawingml/2006/wordprocessingDrawing" xmlns:w10="urn:schemas-microsoft-com:office:word" xmlns:w="http://schemas.openxmlformats.org/wordprocessingml/2006/main" xmlns:w14="http://schemas.microsoft.com/office/word/2010/wordml" xmlns:w15="http://schemas.microsoft.com/office/word/2012/wordml" xmlns:w16cex="http://schemas.microsoft.com/office/word/2018/wordml/cex" xmlns:w16cid="http://schemas.microsoft.com/office/word/2016/wordml/cid" xmlns:w16="http://schemas.microsoft.com/office/word/2018/wordml" xmlns:w16du="http://schemas.microsoft.com/office/word/2023/wordml/word16du" xmlns:w16sdtdh="http://schemas.microsoft.com/office/word/2020/wordml/sdtdatahash" xmlns:w16sdtfl="http://schemas.microsoft.com/office/word/2024/wordml/sdtformatlock" xmlns:w16se="http://schemas.microsoft.com/office/word/2015/wordml/symex" xmlns:wpg="http://schemas.microsoft.com/office/word/2010/wordprocessingGroup" xmlns:wpi="http://schemas.microsoft.com/office/word/2010/wordprocessingInk" xmlns:wne="http://schemas.microsoft.com/office/word/2006/wordml" xmlns:wps="http://schemas.microsoft.com/office/word/2010/wordprocessingShape" mc:Ignorable="w14 w15 w16se w16cid w16 w16cex w16sdtdh w16sdtfl w16du wp14">
   <w:abstractNum w:abstractNumId="0" w15:restartNumberingAfterBreak="0">
     <w:nsid w:val="07CA081B"/>
     <w:multiLevelType w:val="hybridMultilevel"/>
@@ -610,6 +772,184 @@
     </w:lvl>
   </w:abstractNum>
   <w:abstractNum w:abstractNumId="1" w15:restartNumberingAfterBreak="0">
+    <w:nsid w:val="0E9219C3"/>
+    <w:multiLevelType w:val="hybridMultilevel"/>
+    <w:tmpl w:val="C58C14A4"/>
+    <w:lvl w:ilvl="0" w:tplc="6C069BFE">
+      <w:start w:val="1"/>
+      <w:numFmt w:val="decimal"/>
+      <w:lvlText w:val="%1."/>
+      <w:lvlJc w:val="left"/>
+      <w:pPr>
+        <w:ind w:left="360" w:hanging="360"/>
+      </w:pPr>
+      <w:rPr>
+        <w:rFonts w:hint="default"/>
+      </w:rPr>
+    </w:lvl>
+    <w:lvl w:ilvl="1" w:tplc="04090019" w:tentative="1">
+      <w:start w:val="1"/>
+      <w:numFmt w:val="lowerLetter"/>
+      <w:lvlText w:val="%2)"/>
+      <w:lvlJc w:val="left"/>
+      <w:pPr>
+        <w:ind w:left="880" w:hanging="440"/>
+      </w:pPr>
+    </w:lvl>
+    <w:lvl w:ilvl="2" w:tplc="0409001B" w:tentative="1">
+      <w:start w:val="1"/>
+      <w:numFmt w:val="lowerRoman"/>
+      <w:lvlText w:val="%3."/>
+      <w:lvlJc w:val="right"/>
+      <w:pPr>
+        <w:ind w:left="1320" w:hanging="440"/>
+      </w:pPr>
+    </w:lvl>
+    <w:lvl w:ilvl="3" w:tplc="0409000F" w:tentative="1">
+      <w:start w:val="1"/>
+      <w:numFmt w:val="decimal"/>
+      <w:lvlText w:val="%4."/>
+      <w:lvlJc w:val="left"/>
+      <w:pPr>
+        <w:ind w:left="1760" w:hanging="440"/>
+      </w:pPr>
+    </w:lvl>
+    <w:lvl w:ilvl="4" w:tplc="04090019" w:tentative="1">
+      <w:start w:val="1"/>
+      <w:numFmt w:val="lowerLetter"/>
+      <w:lvlText w:val="%5)"/>
+      <w:lvlJc w:val="left"/>
+      <w:pPr>
+        <w:ind w:left="2200" w:hanging="440"/>
+      </w:pPr>
+    </w:lvl>
+    <w:lvl w:ilvl="5" w:tplc="0409001B" w:tentative="1">
+      <w:start w:val="1"/>
+      <w:numFmt w:val="lowerRoman"/>
+      <w:lvlText w:val="%6."/>
+      <w:lvlJc w:val="right"/>
+      <w:pPr>
+        <w:ind w:left="2640" w:hanging="440"/>
+      </w:pPr>
+    </w:lvl>
+    <w:lvl w:ilvl="6" w:tplc="0409000F" w:tentative="1">
+      <w:start w:val="1"/>
+      <w:numFmt w:val="decimal"/>
+      <w:lvlText w:val="%7."/>
+      <w:lvlJc w:val="left"/>
+      <w:pPr>
+        <w:ind w:left="3080" w:hanging="440"/>
+      </w:pPr>
+    </w:lvl>
+    <w:lvl w:ilvl="7" w:tplc="04090019" w:tentative="1">
+      <w:start w:val="1"/>
+      <w:numFmt w:val="lowerLetter"/>
+      <w:lvlText w:val="%8)"/>
+      <w:lvlJc w:val="left"/>
+      <w:pPr>
+        <w:ind w:left="3520" w:hanging="440"/>
+      </w:pPr>
+    </w:lvl>
+    <w:lvl w:ilvl="8" w:tplc="0409001B" w:tentative="1">
+      <w:start w:val="1"/>
+      <w:numFmt w:val="lowerRoman"/>
+      <w:lvlText w:val="%9."/>
+      <w:lvlJc w:val="right"/>
+      <w:pPr>
+        <w:ind w:left="3960" w:hanging="440"/>
+      </w:pPr>
+    </w:lvl>
+  </w:abstractNum>
+  <w:abstractNum w:abstractNumId="2" w15:restartNumberingAfterBreak="0">
+    <w:nsid w:val="2AC617E3"/>
+    <w:multiLevelType w:val="hybridMultilevel"/>
+    <w:tmpl w:val="F4BA30F6"/>
+    <w:lvl w:ilvl="0" w:tplc="8C80AC84">
+      <w:start w:val="1"/>
+      <w:numFmt w:val="decimal"/>
+      <w:lvlText w:val="%1."/>
+      <w:lvlJc w:val="left"/>
+      <w:pPr>
+        <w:ind w:left="360" w:hanging="360"/>
+      </w:pPr>
+      <w:rPr>
+        <w:rFonts w:hint="default"/>
+      </w:rPr>
+    </w:lvl>
+    <w:lvl w:ilvl="1" w:tplc="04090019" w:tentative="1">
+      <w:start w:val="1"/>
+      <w:numFmt w:val="lowerLetter"/>
+      <w:lvlText w:val="%2)"/>
+      <w:lvlJc w:val="left"/>
+      <w:pPr>
+        <w:ind w:left="880" w:hanging="440"/>
+      </w:pPr>
+    </w:lvl>
+    <w:lvl w:ilvl="2" w:tplc="0409001B" w:tentative="1">
+      <w:start w:val="1"/>
+      <w:numFmt w:val="lowerRoman"/>
+      <w:lvlText w:val="%3."/>
+      <w:lvlJc w:val="right"/>
+      <w:pPr>
+        <w:ind w:left="1320" w:hanging="440"/>
+      </w:pPr>
+    </w:lvl>
+    <w:lvl w:ilvl="3" w:tplc="0409000F" w:tentative="1">
+      <w:start w:val="1"/>
+      <w:numFmt w:val="decimal"/>
+      <w:lvlText w:val="%4."/>
+      <w:lvlJc w:val="left"/>
+      <w:pPr>
+        <w:ind w:left="1760" w:hanging="440"/>
+      </w:pPr>
+    </w:lvl>
+    <w:lvl w:ilvl="4" w:tplc="04090019" w:tentative="1">
+      <w:start w:val="1"/>
+      <w:numFmt w:val="lowerLetter"/>
+      <w:lvlText w:val="%5)"/>
+      <w:lvlJc w:val="left"/>
+      <w:pPr>
+        <w:ind w:left="2200" w:hanging="440"/>
+      </w:pPr>
+    </w:lvl>
+    <w:lvl w:ilvl="5" w:tplc="0409001B" w:tentative="1">
+      <w:start w:val="1"/>
+      <w:numFmt w:val="lowerRoman"/>
+      <w:lvlText w:val="%6."/>
+      <w:lvlJc w:val="right"/>
+      <w:pPr>
+        <w:ind w:left="2640" w:hanging="440"/>
+      </w:pPr>
+    </w:lvl>
+    <w:lvl w:ilvl="6" w:tplc="0409000F" w:tentative="1">
+      <w:start w:val="1"/>
+      <w:numFmt w:val="decimal"/>
+      <w:lvlText w:val="%7."/>
+      <w:lvlJc w:val="left"/>
+      <w:pPr>
+        <w:ind w:left="3080" w:hanging="440"/>
+      </w:pPr>
+    </w:lvl>
+    <w:lvl w:ilvl="7" w:tplc="04090019" w:tentative="1">
+      <w:start w:val="1"/>
+      <w:numFmt w:val="lowerLetter"/>
+      <w:lvlText w:val="%8)"/>
+      <w:lvlJc w:val="left"/>
+      <w:pPr>
+        <w:ind w:left="3520" w:hanging="440"/>
+      </w:pPr>
+    </w:lvl>
+    <w:lvl w:ilvl="8" w:tplc="0409001B" w:tentative="1">
+      <w:start w:val="1"/>
+      <w:numFmt w:val="lowerRoman"/>
+      <w:lvlText w:val="%9."/>
+      <w:lvlJc w:val="right"/>
+      <w:pPr>
+        <w:ind w:left="3960" w:hanging="440"/>
+      </w:pPr>
+    </w:lvl>
+  </w:abstractNum>
+  <w:abstractNum w:abstractNumId="3" w15:restartNumberingAfterBreak="0">
     <w:nsid w:val="4526136F"/>
     <w:multiLevelType w:val="hybridMultilevel"/>
     <w:tmpl w:val="9FE21C52"/>
@@ -693,19 +1033,177 @@
       <w:pPr>
         <w:ind w:left="6480" w:hanging="180"/>
       </w:pPr>
+    </w:lvl>
+  </w:abstractNum>
+  <w:abstractNum w:abstractNumId="4" w15:restartNumberingAfterBreak="0">
+    <w:nsid w:val="493C420D"/>
+    <w:multiLevelType w:val="hybridMultilevel"/>
+    <w:tmpl w:val="D04A1C7C"/>
+    <w:lvl w:ilvl="0" w:tplc="C0981D06">
+      <w:start w:val="1"/>
+      <w:numFmt w:val="decimal"/>
+      <w:lvlText w:val="%1."/>
+      <w:lvlJc w:val="left"/>
+      <w:pPr>
+        <w:ind w:left="360" w:hanging="360"/>
+      </w:pPr>
+      <w:rPr>
+        <w:rFonts w:hint="default"/>
+      </w:rPr>
+    </w:lvl>
+    <w:lvl w:ilvl="1" w:tplc="04090019" w:tentative="1">
+      <w:start w:val="1"/>
+      <w:numFmt w:val="lowerLetter"/>
+      <w:lvlText w:val="%2)"/>
+      <w:lvlJc w:val="left"/>
+      <w:pPr>
+        <w:ind w:left="880" w:hanging="440"/>
+      </w:pPr>
+    </w:lvl>
+    <w:lvl w:ilvl="2" w:tplc="0409001B" w:tentative="1">
+      <w:start w:val="1"/>
+      <w:numFmt w:val="lowerRoman"/>
+      <w:lvlText w:val="%3."/>
+      <w:lvlJc w:val="right"/>
+      <w:pPr>
+        <w:ind w:left="1320" w:hanging="440"/>
+      </w:pPr>
+    </w:lvl>
+    <w:lvl w:ilvl="3" w:tplc="0409000F" w:tentative="1">
+      <w:start w:val="1"/>
+      <w:numFmt w:val="decimal"/>
+      <w:lvlText w:val="%4."/>
+      <w:lvlJc w:val="left"/>
+      <w:pPr>
+        <w:ind w:left="1760" w:hanging="440"/>
+      </w:pPr>
+    </w:lvl>
+    <w:lvl w:ilvl="4" w:tplc="04090019" w:tentative="1">
+      <w:start w:val="1"/>
+      <w:numFmt w:val="lowerLetter"/>
+      <w:lvlText w:val="%5)"/>
+      <w:lvlJc w:val="left"/>
+      <w:pPr>
+        <w:ind w:left="2200" w:hanging="440"/>
+      </w:pPr>
+    </w:lvl>
+    <w:lvl w:ilvl="5" w:tplc="0409001B" w:tentative="1">
+      <w:start w:val="1"/>
+      <w:numFmt w:val="lowerRoman"/>
+      <w:lvlText w:val="%6."/>
+      <w:lvlJc w:val="right"/>
+      <w:pPr>
+        <w:ind w:left="2640" w:hanging="440"/>
+      </w:pPr>
+    </w:lvl>
+    <w:lvl w:ilvl="6" w:tplc="0409000F" w:tentative="1">
+      <w:start w:val="1"/>
+      <w:numFmt w:val="decimal"/>
+      <w:lvlText w:val="%7."/>
+      <w:lvlJc w:val="left"/>
+      <w:pPr>
+        <w:ind w:left="3080" w:hanging="440"/>
+      </w:pPr>
+    </w:lvl>
+    <w:lvl w:ilvl="7" w:tplc="04090019" w:tentative="1">
+      <w:start w:val="1"/>
+      <w:numFmt w:val="lowerLetter"/>
+      <w:lvlText w:val="%8)"/>
+      <w:lvlJc w:val="left"/>
+      <w:pPr>
+        <w:ind w:left="3520" w:hanging="440"/>
+      </w:pPr>
+    </w:lvl>
+    <w:lvl w:ilvl="8" w:tplc="0409001B" w:tentative="1">
+      <w:start w:val="1"/>
+      <w:numFmt w:val="lowerRoman"/>
+      <w:lvlText w:val="%9."/>
+      <w:lvlJc w:val="right"/>
+      <w:pPr>
+        <w:ind w:left="3960" w:hanging="440"/>
+      </w:pPr>
+    </w:lvl>
+  </w:abstractNum>
+  <w:abstractNum w:abstractNumId="5" w15:restartNumberingAfterBreak="0">
+    <w:nsid w:val="6B155668"/>
+    <w:multiLevelType w:val="multilevel"/>
+    <w:tmpl w:val="1B0E3442"/>
+    <w:lvl w:ilvl="0">
+      <w:start w:val="1"/>
+      <w:numFmt w:val="decimal"/>
+      <w:lvlText w:val="%1."/>
+      <w:lvlJc w:val="left"/>
+      <w:pPr>
+        <w:tabs>
+          <w:tab w:val="num" w:pos="0"/>
+        </w:tabs>
+        <w:ind w:left="360" w:hanging="360"/>
+      </w:pPr>
+    </w:lvl>
+    <w:lvl w:ilvl="1">
+      <w:numFmt w:val="decimal"/>
+      <w:lvlText w:val=""/>
+      <w:lvlJc w:val="left"/>
+    </w:lvl>
+    <w:lvl w:ilvl="2">
+      <w:numFmt w:val="decimal"/>
+      <w:lvlText w:val=""/>
+      <w:lvlJc w:val="left"/>
+    </w:lvl>
+    <w:lvl w:ilvl="3">
+      <w:numFmt w:val="decimal"/>
+      <w:lvlText w:val=""/>
+      <w:lvlJc w:val="left"/>
+    </w:lvl>
+    <w:lvl w:ilvl="4">
+      <w:numFmt w:val="decimal"/>
+      <w:lvlText w:val=""/>
+      <w:lvlJc w:val="left"/>
+    </w:lvl>
+    <w:lvl w:ilvl="5">
+      <w:numFmt w:val="decimal"/>
+      <w:lvlText w:val=""/>
+      <w:lvlJc w:val="left"/>
+    </w:lvl>
+    <w:lvl w:ilvl="6">
+      <w:numFmt w:val="decimal"/>
+      <w:lvlText w:val=""/>
+      <w:lvlJc w:val="left"/>
+    </w:lvl>
+    <w:lvl w:ilvl="7">
+      <w:numFmt w:val="decimal"/>
+      <w:lvlText w:val=""/>
+      <w:lvlJc w:val="left"/>
+    </w:lvl>
+    <w:lvl w:ilvl="8">
+      <w:numFmt w:val="decimal"/>
+      <w:lvlText w:val=""/>
+      <w:lvlJc w:val="left"/>
     </w:lvl>
   </w:abstractNum>
   <w:num w:numId="1" w16cid:durableId="1487744496">
     <w:abstractNumId w:val="0"/>
   </w:num>
   <w:num w:numId="2" w16cid:durableId="649793368">
+    <w:abstractNumId w:val="3"/>
+  </w:num>
+  <w:num w:numId="3" w16cid:durableId="2084183876">
+    <w:abstractNumId w:val="5"/>
+  </w:num>
+  <w:num w:numId="4" w16cid:durableId="1105729842">
     <w:abstractNumId w:val="1"/>
+  </w:num>
+  <w:num w:numId="5" w16cid:durableId="292490582">
+    <w:abstractNumId w:val="2"/>
+  </w:num>
+  <w:num w:numId="6" w16cid:durableId="1206017412">
+    <w:abstractNumId w:val="4"/>
   </w:num>
 </w:numbering>
 </file>
 
 <file path=word/styles.xml><?xml version="1.0" encoding="utf-8"?>
-<w:styles xmlns:mc="http://schemas.openxmlformats.org/markup-compatibility/2006" xmlns:r="http://schemas.openxmlformats.org/officeDocument/2006/relationships" xmlns:w="http://schemas.openxmlformats.org/wordprocessingml/2006/main" xmlns:w14="http://schemas.microsoft.com/office/word/2010/wordml" xmlns:w15="http://schemas.microsoft.com/office/word/2012/wordml" xmlns:w16cex="http://schemas.microsoft.com/office/word/2018/wordml/cex" xmlns:w16cid="http://schemas.microsoft.com/office/word/2016/wordml/cid" xmlns:w16="http://schemas.microsoft.com/office/word/2018/wordml" xmlns:w16du="http://schemas.microsoft.com/office/word/2023/wordml/word16du" xmlns:w16sdtdh="http://schemas.microsoft.com/office/word/2020/wordml/sdtdatahash" xmlns:w16se="http://schemas.microsoft.com/office/word/2015/wordml/symex" mc:Ignorable="w14 w15 w16se w16cid w16 w16cex w16sdtdh w16du">
+<w:styles xmlns:mc="http://schemas.openxmlformats.org/markup-compatibility/2006" xmlns:r="http://schemas.openxmlformats.org/officeDocument/2006/relationships" xmlns:w="http://schemas.openxmlformats.org/wordprocessingml/2006/main" xmlns:w14="http://schemas.microsoft.com/office/word/2010/wordml" xmlns:w15="http://schemas.microsoft.com/office/word/2012/wordml" xmlns:w16cex="http://schemas.microsoft.com/office/word/2018/wordml/cex" xmlns:w16cid="http://schemas.microsoft.com/office/word/2016/wordml/cid" xmlns:w16="http://schemas.microsoft.com/office/word/2018/wordml" xmlns:w16du="http://schemas.microsoft.com/office/word/2023/wordml/word16du" xmlns:w16sdtdh="http://schemas.microsoft.com/office/word/2020/wordml/sdtdatahash" xmlns:w16sdtfl="http://schemas.microsoft.com/office/word/2024/wordml/sdtformatlock" xmlns:w16se="http://schemas.microsoft.com/office/word/2015/wordml/symex" mc:Ignorable="w14 w15 w16se w16cid w16 w16cex w16sdtdh w16sdtfl w16du">
   <w:docDefaults>
     <w:rPrDefault>
       <w:rPr>
@@ -899,7 +1397,7 @@
     <w:lsdException w:name="Medium Shading 2 Accent 1" w:uiPriority="64"/>
     <w:lsdException w:name="Medium List 1 Accent 1" w:uiPriority="65"/>
     <w:lsdException w:name="Revision" w:semiHidden="1"/>
-    <w:lsdException w:name="List Paragraph" w:uiPriority="34" w:qFormat="1"/>
+    <w:lsdException w:name="List Paragraph" w:uiPriority="0" w:qFormat="1"/>
     <w:lsdException w:name="Quote" w:uiPriority="29" w:qFormat="1"/>
     <w:lsdException w:name="Intense Quote" w:uiPriority="30" w:qFormat="1"/>
     <w:lsdException w:name="Medium List 2 Accent 1" w:uiPriority="66"/>
@@ -1543,7 +2041,6 @@
   <w:style w:type="paragraph" w:styleId="ListParagraph">
     <w:name w:val="List Paragraph"/>
     <w:basedOn w:val="Normal"/>
-    <w:uiPriority w:val="34"/>
     <w:qFormat/>
     <w:rsid w:val="009729E7"/>
     <w:pPr>

</xml_diff>